<commit_message>
Initial commit: PocketPaaS 轻量级容器云平台
</commit_message>
<xml_diff>
--- a/README.docx
+++ b/README.docx
@@ -2,7 +2,7 @@
 <file path=word/document.xml><?xml version="1.0" encoding="utf-8"?>
 <w:document xmlns:w="http://schemas.openxmlformats.org/wordprocessingml/2006/main" xmlns:m="http://schemas.openxmlformats.org/officeDocument/2006/math" xmlns:r="http://schemas.openxmlformats.org/officeDocument/2006/relationships" xmlns:o="urn:schemas-microsoft-com:office:office" xmlns:v="urn:schemas-microsoft-com:vml" xmlns:w10="urn:schemas-microsoft-com:office:word" xmlns:a="http://schemas.openxmlformats.org/drawingml/2006/main" xmlns:pic="http://schemas.openxmlformats.org/drawingml/2006/picture" xmlns:wp="http://schemas.openxmlformats.org/drawingml/2006/wordprocessingDrawing">
   <w:body>
-    <w:bookmarkStart w:id="33" w:name="pocketpaas"/>
+    <w:bookmarkStart w:id="34" w:name="pocketpaas"/>
     <w:p>
       <w:pPr>
         <w:pStyle w:val="Heading1"/>
@@ -12284,7 +12284,7 @@
       </w:r>
     </w:p>
     <w:bookmarkEnd w:id="30"/>
-    <w:bookmarkStart w:id="31" w:name="许可证"/>
+    <w:bookmarkStart w:id="32" w:name="许可证"/>
     <w:p>
       <w:pPr>
         <w:pStyle w:val="Heading2"/>
@@ -12304,55 +12304,156 @@
         <w:rPr>
           <w:rFonts w:hint="eastAsia"/>
         </w:rPr>
-        <w:t xml:space="preserve">本仓库</w:t>
-      </w:r>
-      <w:r>
-        <w:rPr>
-          <w:rFonts w:hint="eastAsia"/>
-          <w:b/>
-          <w:bCs/>
-        </w:rPr>
-        <w:t xml:space="preserve">暂未添加</w:t>
-      </w:r>
-      <w:r>
-        <w:rPr>
-          <w:b/>
-          <w:bCs/>
-        </w:rPr>
-        <w:t xml:space="preserve"> </w:t>
-      </w:r>
-      <w:r>
-        <w:rPr>
-          <w:rStyle w:val="VerbatimChar"/>
-          <w:b/>
-          <w:bCs/>
-        </w:rPr>
-        <w:t xml:space="preserve">LICENSE</w:t>
-      </w:r>
-      <w:r>
-        <w:rPr>
-          <w:b/>
-          <w:bCs/>
-        </w:rPr>
-        <w:t xml:space="preserve"> </w:t>
-      </w:r>
-      <w:r>
-        <w:rPr>
-          <w:rFonts w:hint="eastAsia"/>
-          <w:b/>
-          <w:bCs/>
-        </w:rPr>
-        <w:t xml:space="preserve">文件</w:t>
-      </w:r>
-      <w:r>
-        <w:rPr>
-          <w:rFonts w:hint="eastAsia"/>
-        </w:rPr>
-        <w:t xml:space="preserve">。如需开源，请自行补充合适的许可证。</w:t>
+        <w:t xml:space="preserve">本项目采用</w:t>
+      </w:r>
+      <w:r>
+        <w:t xml:space="preserve"> </w:t>
+      </w:r>
+      <w:r>
+        <w:rPr>
+          <w:b/>
+          <w:bCs/>
+        </w:rPr>
+        <w:t xml:space="preserve">GNU General Public License </w:t>
+      </w:r>
+      <w:r>
+        <w:rPr>
+          <w:rFonts w:hint="eastAsia"/>
+          <w:b/>
+          <w:bCs/>
+        </w:rPr>
+        <w:t xml:space="preserve">v3.0（GPL-3.0）</w:t>
+      </w:r>
+      <w:r>
+        <w:rPr>
+          <w:rFonts w:hint="eastAsia"/>
+        </w:rPr>
+        <w:t xml:space="preserve">，全文见</w:t>
+      </w:r>
+      <w:r>
+        <w:t xml:space="preserve"> </w:t>
+      </w:r>
+      <w:hyperlink r:id="rId31">
+        <w:r>
+          <w:rPr>
+            <w:rStyle w:val="Hyperlink"/>
+          </w:rPr>
+          <w:t xml:space="preserve">LICENSE</w:t>
+        </w:r>
+      </w:hyperlink>
+      <w:r>
+        <w:t xml:space="preserve">。</w:t>
       </w:r>
     </w:p>
-    <w:bookmarkEnd w:id="31"/>
-    <w:bookmarkStart w:id="32" w:name="致谢-说明"/>
+    <w:p>
+      <w:pPr>
+        <w:pStyle w:val="BlockText"/>
+      </w:pPr>
+      <w:r>
+        <w:rPr>
+          <w:b/>
+          <w:bCs/>
+        </w:rPr>
+        <w:t xml:space="preserve">GPL-3.0 </w:t>
+      </w:r>
+      <w:r>
+        <w:rPr>
+          <w:rFonts w:hint="eastAsia"/>
+          <w:b/>
+          <w:bCs/>
+        </w:rPr>
+        <w:t xml:space="preserve">是强著佐权（copyleft）许可</w:t>
+      </w:r>
+      <w:r>
+        <w:rPr>
+          <w:rFonts w:hint="eastAsia"/>
+        </w:rPr>
+        <w:t xml:space="preserve">：你可以自由使用、修改、分发，但</w:t>
+      </w:r>
+      <w:r>
+        <w:rPr>
+          <w:rFonts w:hint="eastAsia"/>
+          <w:b/>
+          <w:bCs/>
+        </w:rPr>
+        <w:t xml:space="preserve">分发衍生作品时必须以同样的</w:t>
+      </w:r>
+      <w:r>
+        <w:rPr>
+          <w:b/>
+          <w:bCs/>
+        </w:rPr>
+        <w:t xml:space="preserve"> GPL-3.0 </w:t>
+      </w:r>
+      <w:r>
+        <w:rPr>
+          <w:rFonts w:hint="eastAsia"/>
+          <w:b/>
+          <w:bCs/>
+        </w:rPr>
+        <w:t xml:space="preserve">许可开源并提供完整源码</w:t>
+      </w:r>
+      <w:r>
+        <w:rPr>
+          <w:rFonts w:hint="eastAsia"/>
+        </w:rPr>
+        <w:t xml:space="preserve">，同时保留版权与许可声明。它</w:t>
+      </w:r>
+      <w:r>
+        <w:rPr>
+          <w:rFonts w:hint="eastAsia"/>
+          <w:b/>
+          <w:bCs/>
+        </w:rPr>
+        <w:t xml:space="preserve">不含「网络服务即触发开源」条款</w:t>
+      </w:r>
+      <w:r>
+        <w:rPr>
+          <w:rFonts w:hint="eastAsia"/>
+        </w:rPr>
+        <w:t xml:space="preserve">（那是</w:t>
+      </w:r>
+      <w:r>
+        <w:t xml:space="preserve"> AGPL-3.0 </w:t>
+      </w:r>
+      <w:r>
+        <w:rPr>
+          <w:rFonts w:hint="eastAsia"/>
+        </w:rPr>
+        <w:t xml:space="preserve">的范畴），因此把本项目作为线上服务运行，并不会被要求公开源码。作者不承担担保责任。</w:t>
+      </w:r>
+    </w:p>
+    <w:p>
+      <w:pPr>
+        <w:pStyle w:val="BlockText"/>
+      </w:pPr>
+      <w:r>
+        <w:rPr>
+          <w:rFonts w:hint="eastAsia"/>
+        </w:rPr>
+        <w:t xml:space="preserve">本项目依赖（FastAPI、SQLAlchemy、docker-py、uvicorn、psutil</w:t>
+      </w:r>
+      <w:r>
+        <w:t xml:space="preserve"> </w:t>
+      </w:r>
+      <w:r>
+        <w:rPr>
+          <w:rFonts w:hint="eastAsia"/>
+        </w:rPr>
+        <w:t xml:space="preserve">等）均为宽松许可，可被</w:t>
+      </w:r>
+      <w:r>
+        <w:t xml:space="preserve"> GPL-3.0 </w:t>
+      </w:r>
+      <w:r>
+        <w:rPr>
+          <w:rFonts w:hint="eastAsia"/>
+        </w:rPr>
+        <w:t xml:space="preserve">作品包含，不存在许可冲突。</w:t>
+      </w:r>
+    </w:p>
+    <w:bookmarkEnd w:id="32"/>
+    <w:bookmarkStart w:id="33" w:name="致谢-说明"/>
     <w:p>
       <w:pPr>
         <w:pStyle w:val="Heading2"/>
@@ -12434,8 +12535,8 @@
         <w:t xml:space="preserve">。</w:t>
       </w:r>
     </w:p>
-    <w:bookmarkEnd w:id="32"/>
     <w:bookmarkEnd w:id="33"/>
+    <w:bookmarkEnd w:id="34"/>
     <w:sectPr>
       <w:footnotePr>
         <w:numRestart w:val="eachSect"/>
@@ -13639,7 +13740,7 @@
     <a:fontScheme name="Office">
       <a:majorFont>
         <a:latin typeface="Aptos Display" panose="02110004020202020204"/>
-        <a:ea typeface=""/>
+        <a:ea typeface="微软雅黑"/>
         <a:cs typeface=""/>
         <a:font script="Jpan" typeface="游ゴシック Light"/>
         <a:font script="Hang" typeface="맑은 고딕"/>
@@ -13691,7 +13792,7 @@
       </a:majorFont>
       <a:minorFont>
         <a:latin typeface="Aptos" panose="02110004020202020204"/>
-        <a:ea typeface=""/>
+        <a:ea typeface="微软雅黑"/>
         <a:cs typeface=""/>
         <a:font script="Jpan" typeface="游明朝"/>
         <a:font script="Hang" typeface="맑은 고딕"/>

</xml_diff>